<commit_message>
feat: floating AI Assistant chat button — reuses existing ChatTab system
- FloatingChatButton.vue: floating button + panel overlay wrapping ChatTab
- Uses existing chat.ts store (multi-chat per paper, streaming, backend API)
- Button appears bottom-right when logged in
- Click opens ChatTab in floating overlay panel
- Conversation persists across dashboard ↔ editor
- paperId passed from route params/query for context awareness
- Fixes TokenDetailModal.vue TypeScript errors
- Removes old globalChat.js (unused)

Design: button → click → ChatTab as floating panel
Same system, floating access
</commit_message>
<xml_diff>
--- a/backend/tools/Journal/output/template_test/test_acm.docx
+++ b/backend/tools/Journal/output/template_test/test_acm.docx
@@ -153,6 +153,71 @@
       </w:pPr>
       <w:r>
         <w:t>REFERENCES</w:t>
+      </w:r>
+    </w:p>
+    <w:p>
+      <w:pPr>
+        <w:pStyle w:val="Reference"/>
+      </w:pPr>
+      <w:r>
+        <w:rPr>
+          <w:b w:val="0"/>
+          <w:i w:val="0"/>
+          <w:u w:val="none"/>
+        </w:rPr>
+        <w:t>[1] V, a, s, w, a, n, i, ,,  , A, .,  , e, t,  , a, l, . (2017) "Attention is All You Need,"</w:t>
+      </w:r>
+    </w:p>
+    <w:p>
+      <w:pPr>
+        <w:pStyle w:val="Reference"/>
+      </w:pPr>
+      <w:r>
+        <w:rPr>
+          <w:b w:val="0"/>
+          <w:i w:val="0"/>
+          <w:u w:val="none"/>
+        </w:rPr>
+        <w:t>[2] D, e, v, l, i, n, ,,  , J, .,  , e, t,  , a, l, . (2018) "BERT: Pre-training of Deep Bidirectional Transformers,"</w:t>
+      </w:r>
+    </w:p>
+    <w:p>
+      <w:pPr>
+        <w:pStyle w:val="Reference"/>
+      </w:pPr>
+      <w:r>
+        <w:rPr>
+          <w:b w:val="0"/>
+          <w:i w:val="0"/>
+          <w:u w:val="none"/>
+        </w:rPr>
+        <w:t>[3] B, r, o, w, n, ,,  , T, .,  , e, t,  , a, l, . (2020) "Language Models are Few-Shot Learners,"</w:t>
+      </w:r>
+    </w:p>
+    <w:p>
+      <w:pPr>
+        <w:pStyle w:val="Reference"/>
+      </w:pPr>
+      <w:r>
+        <w:rPr>
+          <w:b w:val="0"/>
+          <w:i w:val="0"/>
+          <w:u w:val="none"/>
+        </w:rPr>
+        <w:t>[4] M, i, k, o, l, o, v, ,,  , T, .,  , e, t,  , a, l, . (2013) "Distributed Representations of Words,"</w:t>
+      </w:r>
+    </w:p>
+    <w:p>
+      <w:pPr>
+        <w:pStyle w:val="Reference"/>
+      </w:pPr>
+      <w:r>
+        <w:rPr>
+          <w:b w:val="0"/>
+          <w:i w:val="0"/>
+          <w:u w:val="none"/>
+        </w:rPr>
+        <w:t>[5] H, o, c, h, r, e, i, t, e, r, ,,  , S, .,  , e, t,  , a, l, . (1997) "Long Short-Term Memory,"</w:t>
       </w:r>
     </w:p>
     <w:sectPr>

</xml_diff>